<commit_message>
adding driver interface functional requirements
</commit_message>
<xml_diff>
--- a/SRS.docx
+++ b/SRS.docx
@@ -25,11 +25,19 @@
           <w:lang w:val="en-US"/>
         </w:rPr>
       </w:pPr>
-      <w:r>
-        <w:rPr>
-          <w:lang w:val="en-US"/>
-        </w:rPr>
-        <w:t>TaxiTap by Git It Done</w:t>
+      <w:proofErr w:type="spellStart"/>
+      <w:r>
+        <w:rPr>
+          <w:lang w:val="en-US"/>
+        </w:rPr>
+        <w:t>TaxiTap</w:t>
+      </w:r>
+      <w:proofErr w:type="spellEnd"/>
+      <w:r>
+        <w:rPr>
+          <w:lang w:val="en-US"/>
+        </w:rPr>
+        <w:t xml:space="preserve"> by Git It Done</w:t>
       </w:r>
     </w:p>
     <w:p>
@@ -55,14 +63,25 @@
           <w:lang w:val="en-US"/>
         </w:rPr>
       </w:pPr>
-      <w:r>
-        <w:rPr>
-          <w:rFonts w:ascii="Arial" w:hAnsi="Arial" w:cs="Arial"/>
-          <w:sz w:val="28"/>
-          <w:szCs w:val="28"/>
-          <w:lang w:val="en-US"/>
-        </w:rPr>
-        <w:t>TaxiTap is a mobile platform designed to revolutionize South Africa’s minibus taxi industry by digitizing route information, eliminating the need for constant hooting, and creating a semi-structured booking system while preserving the flexibility that makes taxis an essential mode of transport. The system connects passengers and taxi operators through a location-aware mobile application that facilitates taxi requests, communicates passenger locations, manages payments, and provides real-time vehicle tracking – all without fundamentally changing the existing system's multi-passenger, flexible route nature.</w:t>
+      <w:proofErr w:type="spellStart"/>
+      <w:r>
+        <w:rPr>
+          <w:rFonts w:ascii="Arial" w:hAnsi="Arial" w:cs="Arial"/>
+          <w:sz w:val="28"/>
+          <w:szCs w:val="28"/>
+          <w:lang w:val="en-US"/>
+        </w:rPr>
+        <w:t>TaxiTap</w:t>
+      </w:r>
+      <w:proofErr w:type="spellEnd"/>
+      <w:r>
+        <w:rPr>
+          <w:rFonts w:ascii="Arial" w:hAnsi="Arial" w:cs="Arial"/>
+          <w:sz w:val="28"/>
+          <w:szCs w:val="28"/>
+          <w:lang w:val="en-US"/>
+        </w:rPr>
+        <w:t xml:space="preserve"> is a mobile platform designed to revolutionize South Africa’s minibus taxi industry by digitizing route information, eliminating the need for constant hooting, and creating a semi-structured booking system while preserving the flexibility that makes taxis an essential mode of transport. The system connects passengers and taxi operators through a location-aware mobile application that facilitates taxi requests, communicates passenger locations, manages payments, and provides real-time vehicle tracking – all without fundamentally changing the existing system's multi-passenger, flexible route nature.</w:t>
       </w:r>
     </w:p>
     <w:p>
@@ -449,7 +468,7 @@
       <w:pPr>
         <w:numPr>
           <w:ilvl w:val="0"/>
-          <w:numId w:val="5"/>
+          <w:numId w:val="6"/>
         </w:numPr>
         <w:rPr>
           <w:rFonts w:ascii="Arial" w:hAnsi="Arial" w:cs="Arial"/>
@@ -460,11 +479,106 @@
       <w:r>
         <w:rPr>
           <w:rFonts w:ascii="Arial" w:hAnsi="Arial" w:cs="Arial"/>
-          <w:sz w:val="28"/>
-          <w:szCs w:val="28"/>
-        </w:rPr>
-        <w:t>Feedback system</w:t>
-      </w:r>
+          <w:b/>
+          <w:bCs/>
+          <w:sz w:val="28"/>
+          <w:szCs w:val="28"/>
+        </w:rPr>
+        <w:t>Driver Interface</w:t>
+      </w:r>
+    </w:p>
+    <w:p>
+      <w:pPr>
+        <w:numPr>
+          <w:ilvl w:val="1"/>
+          <w:numId w:val="6"/>
+        </w:numPr>
+        <w:rPr>
+          <w:rFonts w:ascii="Arial" w:hAnsi="Arial" w:cs="Arial"/>
+          <w:sz w:val="28"/>
+          <w:szCs w:val="28"/>
+        </w:rPr>
+      </w:pPr>
+      <w:r>
+        <w:rPr>
+          <w:rFonts w:ascii="Arial" w:hAnsi="Arial" w:cs="Arial"/>
+          <w:sz w:val="28"/>
+          <w:szCs w:val="28"/>
+        </w:rPr>
+        <w:t>The system shall allow drivers to indicate their availability status (available/not available)</w:t>
+      </w:r>
+    </w:p>
+    <w:p>
+      <w:pPr>
+        <w:numPr>
+          <w:ilvl w:val="1"/>
+          <w:numId w:val="6"/>
+        </w:numPr>
+        <w:rPr>
+          <w:rFonts w:ascii="Arial" w:hAnsi="Arial" w:cs="Arial"/>
+          <w:sz w:val="28"/>
+          <w:szCs w:val="28"/>
+        </w:rPr>
+      </w:pPr>
+      <w:r>
+        <w:rPr>
+          <w:rFonts w:ascii="Arial" w:hAnsi="Arial" w:cs="Arial"/>
+          <w:sz w:val="28"/>
+          <w:szCs w:val="28"/>
+        </w:rPr>
+        <w:t>The system shall display passenger pickup requests along the driver's route</w:t>
+      </w:r>
+    </w:p>
+    <w:p>
+      <w:pPr>
+        <w:numPr>
+          <w:ilvl w:val="1"/>
+          <w:numId w:val="6"/>
+        </w:numPr>
+        <w:rPr>
+          <w:rFonts w:ascii="Arial" w:hAnsi="Arial" w:cs="Arial"/>
+          <w:sz w:val="28"/>
+          <w:szCs w:val="28"/>
+        </w:rPr>
+      </w:pPr>
+      <w:r>
+        <w:rPr>
+          <w:rFonts w:ascii="Arial" w:hAnsi="Arial" w:cs="Arial"/>
+          <w:sz w:val="28"/>
+          <w:szCs w:val="28"/>
+        </w:rPr>
+        <w:t>The system shall enable drivers to accept or decline passenger requests</w:t>
+      </w:r>
+    </w:p>
+    <w:p>
+      <w:pPr>
+        <w:numPr>
+          <w:ilvl w:val="1"/>
+          <w:numId w:val="6"/>
+        </w:numPr>
+        <w:rPr>
+          <w:rFonts w:ascii="Arial" w:hAnsi="Arial" w:cs="Arial"/>
+          <w:sz w:val="28"/>
+          <w:szCs w:val="28"/>
+        </w:rPr>
+      </w:pPr>
+      <w:r>
+        <w:rPr>
+          <w:rFonts w:ascii="Arial" w:hAnsi="Arial" w:cs="Arial"/>
+          <w:sz w:val="28"/>
+          <w:szCs w:val="28"/>
+        </w:rPr>
+        <w:t>The system shall provide turn-by-turn navigation to passenger pickup locations</w:t>
+      </w:r>
+    </w:p>
+    <w:p>
+      <w:pPr>
+        <w:rPr>
+          <w:rFonts w:ascii="Arial" w:hAnsi="Arial" w:cs="Arial"/>
+          <w:sz w:val="28"/>
+          <w:szCs w:val="28"/>
+        </w:rPr>
+      </w:pPr>
     </w:p>
     <w:p>
       <w:pPr>
@@ -484,7 +598,7 @@
           <w:sz w:val="28"/>
           <w:szCs w:val="28"/>
         </w:rPr>
-        <w:t>Alert system</w:t>
+        <w:t>Feedback system</w:t>
       </w:r>
     </w:p>
     <w:p>
@@ -505,6 +619,27 @@
           <w:sz w:val="28"/>
           <w:szCs w:val="28"/>
         </w:rPr>
+        <w:t>Alert system</w:t>
+      </w:r>
+    </w:p>
+    <w:p>
+      <w:pPr>
+        <w:numPr>
+          <w:ilvl w:val="0"/>
+          <w:numId w:val="5"/>
+        </w:numPr>
+        <w:rPr>
+          <w:rFonts w:ascii="Arial" w:hAnsi="Arial" w:cs="Arial"/>
+          <w:sz w:val="28"/>
+          <w:szCs w:val="28"/>
+        </w:rPr>
+      </w:pPr>
+      <w:r>
+        <w:rPr>
+          <w:rFonts w:ascii="Arial" w:hAnsi="Arial" w:cs="Arial"/>
+          <w:sz w:val="28"/>
+          <w:szCs w:val="28"/>
+        </w:rPr>
         <w:t>Payment system</w:t>
       </w:r>
     </w:p>
@@ -538,6 +673,7 @@
         <w:rPr>
           <w:lang w:val="en-US"/>
         </w:rPr>
+        <w:lastRenderedPageBreak/>
         <w:t>Use Case Diagrams</w:t>
       </w:r>
     </w:p>
@@ -657,7 +793,6 @@
         <w:rPr>
           <w:lang w:val="en-US"/>
         </w:rPr>
-        <w:lastRenderedPageBreak/>
         <w:t>Testing Frameworks</w:t>
       </w:r>
     </w:p>
@@ -787,7 +922,27 @@
           <w:szCs w:val="28"/>
           <w:lang w:val="en-US"/>
         </w:rPr>
-        <w:t>Quality requirements determine the overall quality of TaxiTap by specifying criteria that define how well the system performs and behaves.</w:t>
+        <w:t xml:space="preserve">Quality requirements determine the overall quality of </w:t>
+      </w:r>
+      <w:proofErr w:type="spellStart"/>
+      <w:r>
+        <w:rPr>
+          <w:rFonts w:ascii="Arial" w:hAnsi="Arial" w:cs="Arial"/>
+          <w:sz w:val="28"/>
+          <w:szCs w:val="28"/>
+          <w:lang w:val="en-US"/>
+        </w:rPr>
+        <w:t>TaxiTap</w:t>
+      </w:r>
+      <w:proofErr w:type="spellEnd"/>
+      <w:r>
+        <w:rPr>
+          <w:rFonts w:ascii="Arial" w:hAnsi="Arial" w:cs="Arial"/>
+          <w:sz w:val="28"/>
+          <w:szCs w:val="28"/>
+          <w:lang w:val="en-US"/>
+        </w:rPr>
+        <w:t xml:space="preserve"> by specifying criteria that define how well the system performs and behaves.</w:t>
       </w:r>
     </w:p>
     <w:p>
@@ -955,6 +1110,7 @@
           <w:szCs w:val="28"/>
           <w:lang w:val="en-US"/>
         </w:rPr>
+        <w:lastRenderedPageBreak/>
         <w:t>Accessibility</w:t>
       </w:r>
     </w:p>
@@ -1508,6 +1664,123 @@
     </w:lvl>
   </w:abstractNum>
   <w:abstractNum w:abstractNumId="4" w15:restartNumberingAfterBreak="0">
+    <w:nsid w:val="67712CE5"/>
+    <w:multiLevelType w:val="multilevel"/>
+    <w:tmpl w:val="29006652"/>
+    <w:lvl w:ilvl="0">
+      <w:start w:val="1"/>
+      <w:numFmt w:val="decimal"/>
+      <w:lvlText w:val="%1."/>
+      <w:lvlJc w:val="left"/>
+      <w:pPr>
+        <w:tabs>
+          <w:tab w:val="num" w:pos="720"/>
+        </w:tabs>
+        <w:ind w:left="720" w:hanging="360"/>
+      </w:pPr>
+    </w:lvl>
+    <w:lvl w:ilvl="1">
+      <w:start w:val="1"/>
+      <w:numFmt w:val="bullet"/>
+      <w:lvlText w:val="o"/>
+      <w:lvlJc w:val="left"/>
+      <w:pPr>
+        <w:tabs>
+          <w:tab w:val="num" w:pos="1440"/>
+        </w:tabs>
+        <w:ind w:left="1440" w:hanging="360"/>
+      </w:pPr>
+      <w:rPr>
+        <w:rFonts w:ascii="Courier New" w:hAnsi="Courier New" w:hint="default"/>
+        <w:sz w:val="20"/>
+      </w:rPr>
+    </w:lvl>
+    <w:lvl w:ilvl="2" w:tentative="1">
+      <w:start w:val="1"/>
+      <w:numFmt w:val="decimal"/>
+      <w:lvlText w:val="%3."/>
+      <w:lvlJc w:val="left"/>
+      <w:pPr>
+        <w:tabs>
+          <w:tab w:val="num" w:pos="2160"/>
+        </w:tabs>
+        <w:ind w:left="2160" w:hanging="360"/>
+      </w:pPr>
+    </w:lvl>
+    <w:lvl w:ilvl="3" w:tentative="1">
+      <w:start w:val="1"/>
+      <w:numFmt w:val="decimal"/>
+      <w:lvlText w:val="%4."/>
+      <w:lvlJc w:val="left"/>
+      <w:pPr>
+        <w:tabs>
+          <w:tab w:val="num" w:pos="2880"/>
+        </w:tabs>
+        <w:ind w:left="2880" w:hanging="360"/>
+      </w:pPr>
+    </w:lvl>
+    <w:lvl w:ilvl="4" w:tentative="1">
+      <w:start w:val="1"/>
+      <w:numFmt w:val="decimal"/>
+      <w:lvlText w:val="%5."/>
+      <w:lvlJc w:val="left"/>
+      <w:pPr>
+        <w:tabs>
+          <w:tab w:val="num" w:pos="3600"/>
+        </w:tabs>
+        <w:ind w:left="3600" w:hanging="360"/>
+      </w:pPr>
+    </w:lvl>
+    <w:lvl w:ilvl="5" w:tentative="1">
+      <w:start w:val="1"/>
+      <w:numFmt w:val="decimal"/>
+      <w:lvlText w:val="%6."/>
+      <w:lvlJc w:val="left"/>
+      <w:pPr>
+        <w:tabs>
+          <w:tab w:val="num" w:pos="4320"/>
+        </w:tabs>
+        <w:ind w:left="4320" w:hanging="360"/>
+      </w:pPr>
+    </w:lvl>
+    <w:lvl w:ilvl="6" w:tentative="1">
+      <w:start w:val="1"/>
+      <w:numFmt w:val="decimal"/>
+      <w:lvlText w:val="%7."/>
+      <w:lvlJc w:val="left"/>
+      <w:pPr>
+        <w:tabs>
+          <w:tab w:val="num" w:pos="5040"/>
+        </w:tabs>
+        <w:ind w:left="5040" w:hanging="360"/>
+      </w:pPr>
+    </w:lvl>
+    <w:lvl w:ilvl="7" w:tentative="1">
+      <w:start w:val="1"/>
+      <w:numFmt w:val="decimal"/>
+      <w:lvlText w:val="%8."/>
+      <w:lvlJc w:val="left"/>
+      <w:pPr>
+        <w:tabs>
+          <w:tab w:val="num" w:pos="5760"/>
+        </w:tabs>
+        <w:ind w:left="5760" w:hanging="360"/>
+      </w:pPr>
+    </w:lvl>
+    <w:lvl w:ilvl="8" w:tentative="1">
+      <w:start w:val="1"/>
+      <w:numFmt w:val="decimal"/>
+      <w:lvlText w:val="%9."/>
+      <w:lvlJc w:val="left"/>
+      <w:pPr>
+        <w:tabs>
+          <w:tab w:val="num" w:pos="6480"/>
+        </w:tabs>
+        <w:ind w:left="6480" w:hanging="360"/>
+      </w:pPr>
+    </w:lvl>
+  </w:abstractNum>
+  <w:abstractNum w:abstractNumId="5" w15:restartNumberingAfterBreak="0">
     <w:nsid w:val="7D254362"/>
     <w:multiLevelType w:val="multilevel"/>
     <w:tmpl w:val="7468172A"/>
@@ -1633,6 +1906,9 @@
     <w:abstractNumId w:val="3"/>
   </w:num>
   <w:num w:numId="5" w16cid:durableId="247154936">
+    <w:abstractNumId w:val="5"/>
+  </w:num>
+  <w:num w:numId="6" w16cid:durableId="1685009413">
     <w:abstractNumId w:val="4"/>
   </w:num>
 </w:numbering>

</xml_diff>

<commit_message>
Adding Payment System functional requirements
</commit_message>
<xml_diff>
--- a/SRS.docx
+++ b/SRS.docx
@@ -337,25 +337,7 @@
           <w:sz w:val="28"/>
           <w:szCs w:val="28"/>
         </w:rPr>
-        <w:t xml:space="preserve">1.3 Users should be able to Login </w:t>
-      </w:r>
-      <w:proofErr w:type="gramStart"/>
-      <w:r>
-        <w:rPr>
-          <w:rFonts w:ascii="Arial" w:hAnsi="Arial" w:cs="Arial"/>
-          <w:sz w:val="28"/>
-          <w:szCs w:val="28"/>
-        </w:rPr>
-        <w:t>in to</w:t>
-      </w:r>
-      <w:proofErr w:type="gramEnd"/>
-      <w:r>
-        <w:rPr>
-          <w:rFonts w:ascii="Arial" w:hAnsi="Arial" w:cs="Arial"/>
-          <w:sz w:val="28"/>
-          <w:szCs w:val="28"/>
-        </w:rPr>
-        <w:t xml:space="preserve"> the system using a unique username and a password.</w:t>
+        <w:t>1.3 Users should be able to Login in to the system using a unique username and a password.</w:t>
       </w:r>
     </w:p>
     <w:p>
@@ -445,25 +427,7 @@
           <w:sz w:val="28"/>
           <w:szCs w:val="28"/>
         </w:rPr>
-        <w:t xml:space="preserve">2.3 Passengers should be able to request a </w:t>
-      </w:r>
-      <w:proofErr w:type="gramStart"/>
-      <w:r>
-        <w:rPr>
-          <w:rFonts w:ascii="Arial" w:hAnsi="Arial" w:cs="Arial"/>
-          <w:sz w:val="28"/>
-          <w:szCs w:val="28"/>
-        </w:rPr>
-        <w:t>pick up</w:t>
-      </w:r>
-      <w:proofErr w:type="gramEnd"/>
-      <w:r>
-        <w:rPr>
-          <w:rFonts w:ascii="Arial" w:hAnsi="Arial" w:cs="Arial"/>
-          <w:sz w:val="28"/>
-          <w:szCs w:val="28"/>
-        </w:rPr>
-        <w:t xml:space="preserve"> from an approximate location.</w:t>
+        <w:t>2.3 Passengers should be able to request a pick up from an approximate location.</w:t>
       </w:r>
     </w:p>
     <w:p>
@@ -724,6 +688,131 @@
     </w:p>
     <w:p>
       <w:pPr>
+        <w:pStyle w:val="ListParagraph"/>
+        <w:rPr>
+          <w:rFonts w:ascii="Arial" w:hAnsi="Arial" w:cs="Arial"/>
+          <w:sz w:val="28"/>
+          <w:szCs w:val="28"/>
+        </w:rPr>
+      </w:pPr>
+    </w:p>
+    <w:p>
+      <w:pPr>
+        <w:pStyle w:val="ListParagraph"/>
+        <w:numPr>
+          <w:ilvl w:val="0"/>
+          <w:numId w:val="8"/>
+        </w:numPr>
+        <w:spacing w:line="240" w:lineRule="auto"/>
+        <w:rPr>
+          <w:rFonts w:ascii="Arial" w:hAnsi="Arial" w:cs="Arial"/>
+          <w:sz w:val="28"/>
+          <w:szCs w:val="28"/>
+        </w:rPr>
+      </w:pPr>
+      <w:r>
+        <w:rPr>
+          <w:rFonts w:ascii="Arial" w:hAnsi="Arial" w:cs="Arial"/>
+          <w:b/>
+          <w:bCs/>
+          <w:sz w:val="28"/>
+          <w:szCs w:val="28"/>
+        </w:rPr>
+        <w:t>Payment System</w:t>
+      </w:r>
+    </w:p>
+    <w:p>
+      <w:pPr>
+        <w:pStyle w:val="ListParagraph"/>
+        <w:numPr>
+          <w:ilvl w:val="1"/>
+          <w:numId w:val="8"/>
+        </w:numPr>
+        <w:spacing w:line="240" w:lineRule="auto"/>
+        <w:rPr>
+          <w:rFonts w:ascii="Arial" w:hAnsi="Arial" w:cs="Arial"/>
+          <w:sz w:val="28"/>
+          <w:szCs w:val="28"/>
+        </w:rPr>
+      </w:pPr>
+      <w:r>
+        <w:rPr>
+          <w:rFonts w:ascii="Arial" w:hAnsi="Arial" w:cs="Arial"/>
+          <w:sz w:val="28"/>
+          <w:szCs w:val="28"/>
+        </w:rPr>
+        <w:t>The system shall support cash payments recorded in-app</w:t>
+      </w:r>
+    </w:p>
+    <w:p>
+      <w:pPr>
+        <w:pStyle w:val="ListParagraph"/>
+        <w:numPr>
+          <w:ilvl w:val="1"/>
+          <w:numId w:val="8"/>
+        </w:numPr>
+        <w:spacing w:line="240" w:lineRule="auto"/>
+        <w:rPr>
+          <w:rFonts w:ascii="Arial" w:hAnsi="Arial" w:cs="Arial"/>
+          <w:sz w:val="28"/>
+          <w:szCs w:val="28"/>
+        </w:rPr>
+      </w:pPr>
+      <w:r>
+        <w:rPr>
+          <w:rFonts w:ascii="Arial" w:hAnsi="Arial" w:cs="Arial"/>
+          <w:sz w:val="28"/>
+          <w:szCs w:val="28"/>
+        </w:rPr>
+        <w:t>The system shall support digital payments through integrated payment gateways</w:t>
+      </w:r>
+    </w:p>
+    <w:p>
+      <w:pPr>
+        <w:pStyle w:val="ListParagraph"/>
+        <w:numPr>
+          <w:ilvl w:val="1"/>
+          <w:numId w:val="8"/>
+        </w:numPr>
+        <w:spacing w:line="240" w:lineRule="auto"/>
+        <w:rPr>
+          <w:rFonts w:ascii="Arial" w:hAnsi="Arial" w:cs="Arial"/>
+          <w:sz w:val="28"/>
+          <w:szCs w:val="28"/>
+        </w:rPr>
+      </w:pPr>
+      <w:r>
+        <w:rPr>
+          <w:rFonts w:ascii="Arial" w:hAnsi="Arial" w:cs="Arial"/>
+          <w:sz w:val="28"/>
+          <w:szCs w:val="28"/>
+        </w:rPr>
+        <w:t xml:space="preserve">The system shall calculate fares based on distance </w:t>
+      </w:r>
+      <w:proofErr w:type="spellStart"/>
+      <w:r>
+        <w:rPr>
+          <w:rFonts w:ascii="Arial" w:hAnsi="Arial" w:cs="Arial"/>
+          <w:sz w:val="28"/>
+          <w:szCs w:val="28"/>
+        </w:rPr>
+        <w:t>traveled</w:t>
+      </w:r>
+      <w:proofErr w:type="spellEnd"/>
+    </w:p>
+    <w:p>
+      <w:pPr>
+        <w:pStyle w:val="ListParagraph"/>
+        <w:spacing w:line="240" w:lineRule="auto"/>
+        <w:rPr>
+          <w:rFonts w:ascii="Arial" w:hAnsi="Arial" w:cs="Arial"/>
+          <w:sz w:val="28"/>
+          <w:szCs w:val="28"/>
+        </w:rPr>
+      </w:pPr>
+    </w:p>
+    <w:p>
+      <w:pPr>
         <w:numPr>
           <w:ilvl w:val="0"/>
           <w:numId w:val="5"/>
@@ -740,7 +829,6 @@
           <w:sz w:val="28"/>
           <w:szCs w:val="28"/>
         </w:rPr>
-        <w:lastRenderedPageBreak/>
         <w:t>Feedback system</w:t>
       </w:r>
     </w:p>
@@ -835,27 +923,7 @@
           <w:szCs w:val="28"/>
           <w:lang w:val="en-US"/>
         </w:rPr>
-        <w:t xml:space="preserve">Use case diagrams of different parts of </w:t>
-      </w:r>
-      <w:proofErr w:type="gramStart"/>
-      <w:r>
-        <w:rPr>
-          <w:rFonts w:ascii="Arial" w:hAnsi="Arial" w:cs="Arial"/>
-          <w:sz w:val="28"/>
-          <w:szCs w:val="28"/>
-          <w:lang w:val="en-US"/>
-        </w:rPr>
-        <w:t>system</w:t>
-      </w:r>
-      <w:proofErr w:type="gramEnd"/>
-      <w:r>
-        <w:rPr>
-          <w:rFonts w:ascii="Arial" w:hAnsi="Arial" w:cs="Arial"/>
-          <w:sz w:val="28"/>
-          <w:szCs w:val="28"/>
-          <w:lang w:val="en-US"/>
-        </w:rPr>
-        <w:t>.</w:t>
+        <w:t>Use case diagrams of different parts of system.</w:t>
       </w:r>
     </w:p>
     <w:p>
@@ -1027,6 +1095,7 @@
         <w:rPr>
           <w:lang w:val="en-US"/>
         </w:rPr>
+        <w:lastRenderedPageBreak/>
         <w:t>Documentation</w:t>
       </w:r>
     </w:p>
@@ -1051,7 +1120,6 @@
         <w:rPr>
           <w:lang w:val="en-US"/>
         </w:rPr>
-        <w:lastRenderedPageBreak/>
         <w:t>Architectural Requirements</w:t>
       </w:r>
     </w:p>
@@ -1406,27 +1474,7 @@
           <w:szCs w:val="28"/>
           <w:lang w:val="en-US"/>
         </w:rPr>
-        <w:t xml:space="preserve">Constraints </w:t>
-      </w:r>
-      <w:proofErr w:type="gramStart"/>
-      <w:r>
-        <w:rPr>
-          <w:rFonts w:ascii="Arial" w:hAnsi="Arial" w:cs="Arial"/>
-          <w:sz w:val="28"/>
-          <w:szCs w:val="28"/>
-          <w:lang w:val="en-US"/>
-        </w:rPr>
-        <w:t>client</w:t>
-      </w:r>
-      <w:proofErr w:type="gramEnd"/>
-      <w:r>
-        <w:rPr>
-          <w:rFonts w:ascii="Arial" w:hAnsi="Arial" w:cs="Arial"/>
-          <w:sz w:val="28"/>
-          <w:szCs w:val="28"/>
-          <w:lang w:val="en-US"/>
-        </w:rPr>
-        <w:t xml:space="preserve"> laid out.</w:t>
+        <w:t>Constraints client laid out.</w:t>
       </w:r>
     </w:p>
     <w:sectPr>
@@ -2076,6 +2124,123 @@
     </w:lvl>
   </w:abstractNum>
   <w:abstractNum w:abstractNumId="6" w15:restartNumberingAfterBreak="0">
+    <w:nsid w:val="791E39ED"/>
+    <w:multiLevelType w:val="multilevel"/>
+    <w:tmpl w:val="059ED05E"/>
+    <w:lvl w:ilvl="0">
+      <w:start w:val="1"/>
+      <w:numFmt w:val="decimal"/>
+      <w:lvlText w:val="%1."/>
+      <w:lvlJc w:val="left"/>
+      <w:pPr>
+        <w:tabs>
+          <w:tab w:val="num" w:pos="720"/>
+        </w:tabs>
+        <w:ind w:left="720" w:hanging="360"/>
+      </w:pPr>
+    </w:lvl>
+    <w:lvl w:ilvl="1">
+      <w:start w:val="1"/>
+      <w:numFmt w:val="bullet"/>
+      <w:lvlText w:val="o"/>
+      <w:lvlJc w:val="left"/>
+      <w:pPr>
+        <w:tabs>
+          <w:tab w:val="num" w:pos="1440"/>
+        </w:tabs>
+        <w:ind w:left="1440" w:hanging="360"/>
+      </w:pPr>
+      <w:rPr>
+        <w:rFonts w:ascii="Courier New" w:hAnsi="Courier New" w:hint="default"/>
+        <w:sz w:val="20"/>
+      </w:rPr>
+    </w:lvl>
+    <w:lvl w:ilvl="2" w:tentative="1">
+      <w:start w:val="1"/>
+      <w:numFmt w:val="decimal"/>
+      <w:lvlText w:val="%3."/>
+      <w:lvlJc w:val="left"/>
+      <w:pPr>
+        <w:tabs>
+          <w:tab w:val="num" w:pos="2160"/>
+        </w:tabs>
+        <w:ind w:left="2160" w:hanging="360"/>
+      </w:pPr>
+    </w:lvl>
+    <w:lvl w:ilvl="3" w:tentative="1">
+      <w:start w:val="1"/>
+      <w:numFmt w:val="decimal"/>
+      <w:lvlText w:val="%4."/>
+      <w:lvlJc w:val="left"/>
+      <w:pPr>
+        <w:tabs>
+          <w:tab w:val="num" w:pos="2880"/>
+        </w:tabs>
+        <w:ind w:left="2880" w:hanging="360"/>
+      </w:pPr>
+    </w:lvl>
+    <w:lvl w:ilvl="4" w:tentative="1">
+      <w:start w:val="1"/>
+      <w:numFmt w:val="decimal"/>
+      <w:lvlText w:val="%5."/>
+      <w:lvlJc w:val="left"/>
+      <w:pPr>
+        <w:tabs>
+          <w:tab w:val="num" w:pos="3600"/>
+        </w:tabs>
+        <w:ind w:left="3600" w:hanging="360"/>
+      </w:pPr>
+    </w:lvl>
+    <w:lvl w:ilvl="5" w:tentative="1">
+      <w:start w:val="1"/>
+      <w:numFmt w:val="decimal"/>
+      <w:lvlText w:val="%6."/>
+      <w:lvlJc w:val="left"/>
+      <w:pPr>
+        <w:tabs>
+          <w:tab w:val="num" w:pos="4320"/>
+        </w:tabs>
+        <w:ind w:left="4320" w:hanging="360"/>
+      </w:pPr>
+    </w:lvl>
+    <w:lvl w:ilvl="6" w:tentative="1">
+      <w:start w:val="1"/>
+      <w:numFmt w:val="decimal"/>
+      <w:lvlText w:val="%7."/>
+      <w:lvlJc w:val="left"/>
+      <w:pPr>
+        <w:tabs>
+          <w:tab w:val="num" w:pos="5040"/>
+        </w:tabs>
+        <w:ind w:left="5040" w:hanging="360"/>
+      </w:pPr>
+    </w:lvl>
+    <w:lvl w:ilvl="7" w:tentative="1">
+      <w:start w:val="1"/>
+      <w:numFmt w:val="decimal"/>
+      <w:lvlText w:val="%8."/>
+      <w:lvlJc w:val="left"/>
+      <w:pPr>
+        <w:tabs>
+          <w:tab w:val="num" w:pos="5760"/>
+        </w:tabs>
+        <w:ind w:left="5760" w:hanging="360"/>
+      </w:pPr>
+    </w:lvl>
+    <w:lvl w:ilvl="8" w:tentative="1">
+      <w:start w:val="1"/>
+      <w:numFmt w:val="decimal"/>
+      <w:lvlText w:val="%9."/>
+      <w:lvlJc w:val="left"/>
+      <w:pPr>
+        <w:tabs>
+          <w:tab w:val="num" w:pos="6480"/>
+        </w:tabs>
+        <w:ind w:left="6480" w:hanging="360"/>
+      </w:pPr>
+    </w:lvl>
+  </w:abstractNum>
+  <w:abstractNum w:abstractNumId="7" w15:restartNumberingAfterBreak="0">
     <w:nsid w:val="7D254362"/>
     <w:multiLevelType w:val="multilevel"/>
     <w:tmpl w:val="7468172A"/>
@@ -2201,13 +2366,16 @@
     <w:abstractNumId w:val="4"/>
   </w:num>
   <w:num w:numId="5" w16cid:durableId="247154936">
-    <w:abstractNumId w:val="6"/>
+    <w:abstractNumId w:val="7"/>
   </w:num>
   <w:num w:numId="6" w16cid:durableId="1685009413">
     <w:abstractNumId w:val="5"/>
   </w:num>
   <w:num w:numId="7" w16cid:durableId="818619671">
     <w:abstractNumId w:val="3"/>
+  </w:num>
+  <w:num w:numId="8" w16cid:durableId="808202761">
+    <w:abstractNumId w:val="6"/>
   </w:num>
 </w:numbering>
 </file>

</xml_diff>